<commit_message>
Update CV: AGU Advances paper now in press (DOI 10.1029/2026AV002517)
Co-Authored-By: Claude Opus 4.8 <noreply@anthropic.com>
</commit_message>
<xml_diff>
--- a/assets/files/Nicholas_OMara_CV.docx
+++ b/assets/files/Nicholas_OMara_CV.docx
@@ -193,12 +193,25 @@
           <w:p>
             <w:pPr>
               <w:jc w:val="right"/>
+            </w:pPr>
+            <w:hyperlink r:id="rId7" w:history="1">
+              <w:r>
+                <w:rPr>
+                  <w:rStyle w:val="Hyperlink"/>
+                </w:rPr>
+                <w:t>nickomara.com</w:t>
+              </w:r>
+            </w:hyperlink>
+          </w:p>
+          <w:p>
+            <w:pPr>
+              <w:jc w:val="right"/>
               <w:rPr>
                 <w:color w:val="000000" w:themeColor="text1"/>
                 <w:szCs w:val="22"/>
               </w:rPr>
             </w:pPr>
-            <w:hyperlink r:id="rId7" w:history="1">
+            <w:hyperlink r:id="rId8" w:history="1">
               <w:r>
                 <w:rPr>
                   <w:rStyle w:val="Hyperlink"/>
@@ -216,7 +229,7 @@
                 <w:szCs w:val="22"/>
               </w:rPr>
             </w:pPr>
-            <w:hyperlink r:id="rId8" w:history="1">
+            <w:hyperlink r:id="rId9" w:history="1">
               <w:r>
                 <w:rPr>
                   <w:rStyle w:val="Hyperlink"/>
@@ -234,7 +247,7 @@
                 <w:szCs w:val="22"/>
               </w:rPr>
             </w:pPr>
-            <w:hyperlink r:id="rId9" w:history="1">
+            <w:hyperlink r:id="rId10" w:history="1">
               <w:r>
                 <w:rPr>
                   <w:rStyle w:val="Hyperlink"/>
@@ -1218,7 +1231,14 @@
                 <w:i/>
                 <w:color w:val="000000"/>
               </w:rPr>
-              <w:t xml:space="preserve"> (accepted</w:t>
+              <w:t xml:space="preserve"> (</w:t>
+            </w:r>
+            <w:r>
+              <w:rPr>
+                <w:i/>
+                <w:color w:val="000000"/>
+              </w:rPr>
+              <w:t>in press; DOI:10.1029/2026AV002517</w:t>
             </w:r>
             <w:r>
               <w:rPr>
@@ -1304,7 +1324,7 @@
               </w:rPr>
               <w:t xml:space="preserve"> (</w:t>
             </w:r>
-            <w:hyperlink r:id="rId10" w:history="1">
+            <w:hyperlink r:id="rId11" w:history="1">
               <w:r>
                 <w:rPr>
                   <w:rStyle w:val="Hyperlink"/>
@@ -1398,7 +1418,7 @@
               </w:rPr>
               <w:t xml:space="preserve"> (</w:t>
             </w:r>
-            <w:hyperlink r:id="rId11" w:history="1">
+            <w:hyperlink r:id="rId12" w:history="1">
               <w:r>
                 <w:rPr>
                   <w:rStyle w:val="Hyperlink"/>
@@ -1497,7 +1517,7 @@
               </w:rPr>
               <w:t xml:space="preserve"> (</w:t>
             </w:r>
-            <w:hyperlink r:id="rId12" w:history="1">
+            <w:hyperlink r:id="rId13" w:history="1">
               <w:r>
                 <w:rPr>
                   <w:rStyle w:val="Hyperlink"/>
@@ -1605,7 +1625,7 @@
               </w:rPr>
               <w:t xml:space="preserve"> (</w:t>
             </w:r>
-            <w:hyperlink r:id="rId13" w:history="1">
+            <w:hyperlink r:id="rId14" w:history="1">
               <w:r>
                 <w:rPr>
                   <w:rStyle w:val="Hyperlink"/>
@@ -1686,7 +1706,7 @@
             <w:r>
               <w:t>(</w:t>
             </w:r>
-            <w:hyperlink r:id="rId14" w:history="1">
+            <w:hyperlink r:id="rId15" w:history="1">
               <w:r>
                 <w:rPr>
                   <w:rStyle w:val="Hyperlink"/>
@@ -1765,7 +1785,7 @@
             <w:r>
               <w:t xml:space="preserve"> (</w:t>
             </w:r>
-            <w:hyperlink r:id="rId15" w:history="1">
+            <w:hyperlink r:id="rId16" w:history="1">
               <w:r>
                 <w:rPr>
                   <w:rStyle w:val="Hyperlink"/>
@@ -7145,8 +7165,8 @@
       </w:r>
     </w:p>
     <w:sectPr>
-      <w:footerReference w:type="even" r:id="rId16"/>
-      <w:footerReference w:type="default" r:id="rId17"/>
+      <w:footerReference w:type="even" r:id="rId17"/>
+      <w:footerReference w:type="default" r:id="rId18"/>
       <w:pgSz w:w="12240" w:h="15840"/>
       <w:pgMar w:top="1080" w:right="1080" w:bottom="1080" w:left="1080" w:header="720" w:footer="720" w:gutter="0"/>
       <w:cols w:space="720"/>

</xml_diff>

<commit_message>
Update CV and site: new publications, experience PI details, 2026 AGU convener role
Co-Authored-By: Claude Opus 4.8 <noreply@anthropic.com>
</commit_message>
<xml_diff>
--- a/assets/files/Nicholas_OMara_CV.docx
+++ b/assets/files/Nicholas_OMara_CV.docx
@@ -664,9 +664,17 @@
             <w:tcW w:w="1440" w:type="dxa"/>
           </w:tcPr>
           <w:p>
-            <w:r>
-              <w:rPr>
-                <w:b/>
+            <w:pPr>
+              <w:rPr>
+                <w:i/>
+                <w:iCs/>
+              </w:rPr>
+            </w:pPr>
+            <w:r>
+              <w:rPr>
+                <w:b/>
+                <w:i/>
+                <w:iCs/>
               </w:rPr>
               <w:t>2027–2030</w:t>
             </w:r>
@@ -697,6 +705,24 @@
                 <w:color w:val="000000"/>
               </w:rPr>
               <w:t>Department of Ecology and Evolutionary Biology, Princeton</w:t>
+            </w:r>
+            <w:r>
+              <w:rPr>
+                <w:color w:val="000000"/>
+              </w:rPr>
+              <w:t xml:space="preserve"> University</w:t>
+            </w:r>
+            <w:r>
+              <w:rPr>
+                <w:color w:val="000000"/>
+              </w:rPr>
+              <w:t>, PI: Carla Staver</w:t>
+            </w:r>
+            <w:r>
+              <w:rPr>
+                <w:color w:val="000000"/>
+              </w:rPr>
+              <w:t xml:space="preserve">. Appointment to begin January 1, 2027. </w:t>
             </w:r>
           </w:p>
         </w:tc>
@@ -750,6 +776,12 @@
               </w:rPr>
               <w:t>Department of Ecology and Evolutionary Biology, Princeton University</w:t>
             </w:r>
+            <w:r>
+              <w:rPr>
+                <w:color w:val="000000"/>
+              </w:rPr>
+              <w:t>, PI: Carla Staver</w:t>
+            </w:r>
           </w:p>
         </w:tc>
       </w:tr>
@@ -810,6 +842,12 @@
               </w:rPr>
               <w:t>Yale Institute for Biospheric Studies</w:t>
             </w:r>
+            <w:r>
+              <w:rPr>
+                <w:color w:val="000000"/>
+              </w:rPr>
+              <w:t xml:space="preserve">, PI: Jennifer Marlon </w:t>
+            </w:r>
           </w:p>
         </w:tc>
       </w:tr>
@@ -922,6 +960,12 @@
               </w:rPr>
               <w:t>of Columbia University</w:t>
             </w:r>
+            <w:r>
+              <w:rPr>
+                <w:color w:val="000000"/>
+              </w:rPr>
+              <w:t>, PI: Pratigya Polissar</w:t>
+            </w:r>
           </w:p>
         </w:tc>
       </w:tr>
@@ -1007,7 +1051,21 @@
           </w:tcPr>
           <w:p>
             <w:r>
-              <w:t>Summer research internship (2016) at</w:t>
+              <w:rPr>
+                <w:b/>
+                <w:bCs/>
+              </w:rPr>
+              <w:t>NOAA s</w:t>
+            </w:r>
+            <w:r>
+              <w:rPr>
+                <w:b/>
+                <w:bCs/>
+              </w:rPr>
+              <w:t>ummer research internship</w:t>
+            </w:r>
+            <w:r>
+              <w:t>,</w:t>
             </w:r>
             <w:r>
               <w:rPr>
@@ -1109,7 +1167,7 @@
     </w:p>
     <w:tbl>
       <w:tblPr>
-        <w:tblW w:w="0" w:type="auto"/>
+        <w:tblW w:w="10080" w:type="dxa"/>
         <w:tblLayout w:type="fixed"/>
         <w:tblCellMar>
           <w:left w:w="0" w:type="dxa"/>
@@ -1156,11 +1214,19 @@
         </w:tc>
       </w:tr>
       <w:tr>
-        <w:tc>
-          <w:tcPr>
-            <w:tcW w:w="1440" w:type="dxa"/>
-          </w:tcPr>
-          <w:p>
+        <w:trPr>
+          <w:trHeight w:val="863"/>
+        </w:trPr>
+        <w:tc>
+          <w:tcPr>
+            <w:tcW w:w="1440" w:type="dxa"/>
+          </w:tcPr>
+          <w:p>
+            <w:pPr>
+              <w:rPr>
+                <w:b/>
+              </w:rPr>
+            </w:pPr>
             <w:r>
               <w:rPr>
                 <w:b/>
@@ -1168,6 +1234,15 @@
               <w:t>2026</w:t>
             </w:r>
           </w:p>
+          <w:p/>
+          <w:p>
+            <w:pPr>
+              <w:rPr>
+                <w:b/>
+                <w:bCs/>
+              </w:rPr>
+            </w:pPr>
+          </w:p>
         </w:tc>
         <w:tc>
           <w:tcPr>
@@ -1202,6 +1277,8 @@
             </w:r>
             <w:r>
               <w:rPr>
+                <w:b/>
+                <w:bCs/>
                 <w:color w:val="000000"/>
               </w:rPr>
               <w:t>Fire biomarkers in marine sediments record terrestrial fire activity</w:t>
@@ -1244,6 +1321,136 @@
               <w:rPr>
                 <w:color w:val="000000"/>
               </w:rPr>
+              <w:t>)</w:t>
+            </w:r>
+          </w:p>
+        </w:tc>
+      </w:tr>
+      <w:tr>
+        <w:trPr>
+          <w:trHeight w:val="115"/>
+        </w:trPr>
+        <w:tc>
+          <w:tcPr>
+            <w:tcW w:w="1440" w:type="dxa"/>
+          </w:tcPr>
+          <w:p>
+            <w:pPr>
+              <w:rPr>
+                <w:b/>
+                <w:sz w:val="12"/>
+                <w:szCs w:val="12"/>
+              </w:rPr>
+            </w:pPr>
+          </w:p>
+        </w:tc>
+        <w:tc>
+          <w:tcPr>
+            <w:tcW w:w="8640" w:type="dxa"/>
+          </w:tcPr>
+          <w:p>
+            <w:pPr>
+              <w:rPr>
+                <w:b/>
+                <w:color w:val="000000"/>
+                <w:sz w:val="12"/>
+                <w:szCs w:val="12"/>
+              </w:rPr>
+            </w:pPr>
+          </w:p>
+        </w:tc>
+      </w:tr>
+      <w:tr>
+        <w:trPr>
+          <w:trHeight w:val="953"/>
+        </w:trPr>
+        <w:tc>
+          <w:tcPr>
+            <w:tcW w:w="1440" w:type="dxa"/>
+          </w:tcPr>
+          <w:p>
+            <w:pPr>
+              <w:rPr>
+                <w:b/>
+              </w:rPr>
+            </w:pPr>
+            <w:r>
+              <w:rPr>
+                <w:b/>
+                <w:bCs/>
+              </w:rPr>
+              <w:lastRenderedPageBreak/>
+              <w:t>2026</w:t>
+            </w:r>
+          </w:p>
+        </w:tc>
+        <w:tc>
+          <w:tcPr>
+            <w:tcW w:w="8640" w:type="dxa"/>
+          </w:tcPr>
+          <w:p>
+            <w:pPr>
+              <w:rPr>
+                <w:b/>
+                <w:color w:val="000000"/>
+              </w:rPr>
+            </w:pPr>
+            <w:r>
+              <w:t xml:space="preserve">Ivory, S.J.; Marlon, J.R.; Leys, B.; </w:t>
+            </w:r>
+            <w:proofErr w:type="spellStart"/>
+            <w:r>
+              <w:t>Glückler</w:t>
+            </w:r>
+            <w:proofErr w:type="spellEnd"/>
+            <w:r>
+              <w:t xml:space="preserve">, R.; O’Mara, N.A.; Dietze, E.; Williams, J.W.; (2026) </w:t>
+            </w:r>
+            <w:r>
+              <w:rPr>
+                <w:b/>
+                <w:bCs/>
+              </w:rPr>
+              <w:t xml:space="preserve">The Global </w:t>
+            </w:r>
+            <w:proofErr w:type="spellStart"/>
+            <w:r>
+              <w:rPr>
+                <w:b/>
+                <w:bCs/>
+              </w:rPr>
+              <w:t>Paleoofire</w:t>
+            </w:r>
+            <w:proofErr w:type="spellEnd"/>
+            <w:r>
+              <w:rPr>
+                <w:b/>
+                <w:bCs/>
+              </w:rPr>
+              <w:t xml:space="preserve"> Database in Neotoma: Next steps toward integration</w:t>
+            </w:r>
+            <w:r>
+              <w:t xml:space="preserve">, </w:t>
+            </w:r>
+            <w:r>
+              <w:rPr>
+                <w:i/>
+                <w:iCs/>
+              </w:rPr>
+              <w:t>Past Global Changes Magazine</w:t>
+            </w:r>
+            <w:r>
+              <w:t xml:space="preserve"> (</w:t>
+            </w:r>
+            <w:hyperlink r:id="rId11" w:tgtFrame="_blank" w:history="1">
+              <w:r>
+                <w:rPr>
+                  <w:rStyle w:val="Hyperlink"/>
+                </w:rPr>
+                <w:t>https://doi.org/10.22498/pages.34.2.94</w:t>
+              </w:r>
+            </w:hyperlink>
+            <w:r>
               <w:t>)</w:t>
             </w:r>
           </w:p>
@@ -1309,7 +1516,15 @@
               <w:rPr>
                 <w:color w:val="000000"/>
               </w:rPr>
-              <w:t>) Capturing vegetation gradients along the West African margin using terrestrial plant biomarkers in marine sediments</w:t>
+              <w:t xml:space="preserve">) </w:t>
+            </w:r>
+            <w:r>
+              <w:rPr>
+                <w:b/>
+                <w:bCs/>
+                <w:color w:val="000000"/>
+              </w:rPr>
+              <w:t>Capturing vegetation gradients along the West African margin using terrestrial plant biomarkers in marine sediments</w:t>
             </w:r>
             <w:r>
               <w:rPr>
@@ -1324,7 +1539,7 @@
               </w:rPr>
               <w:t xml:space="preserve"> (</w:t>
             </w:r>
-            <w:hyperlink r:id="rId11" w:history="1">
+            <w:hyperlink r:id="rId12" w:history="1">
               <w:r>
                 <w:rPr>
                   <w:rStyle w:val="Hyperlink"/>
@@ -1369,7 +1584,6 @@
               <w:rPr>
                 <w:b/>
               </w:rPr>
-              <w:lastRenderedPageBreak/>
               <w:t>2024</w:t>
             </w:r>
           </w:p>
@@ -1403,7 +1617,21 @@
               <w:rPr>
                 <w:color w:val="000000"/>
               </w:rPr>
-              <w:t xml:space="preserve">) Constraining Plio-Pleistocene shifts in Northwest African hydroclimate, ecosystem distributions, and marine productivity: new paleo-records across the Mid-Pleistocene Transition, </w:t>
+              <w:t xml:space="preserve">) </w:t>
+            </w:r>
+            <w:r>
+              <w:rPr>
+                <w:b/>
+                <w:bCs/>
+                <w:color w:val="000000"/>
+              </w:rPr>
+              <w:t>Constraining Plio-Pleistocene shifts in Northwest African hydroclimate, ecosystem distributions, and marine productivity: new paleo-records across the Mid-Pleistocene Transition</w:t>
+            </w:r>
+            <w:r>
+              <w:rPr>
+                <w:color w:val="000000"/>
+              </w:rPr>
+              <w:t xml:space="preserve">, </w:t>
             </w:r>
             <w:r>
               <w:rPr>
@@ -1418,7 +1646,7 @@
               </w:rPr>
               <w:t xml:space="preserve"> (</w:t>
             </w:r>
-            <w:hyperlink r:id="rId12" w:history="1">
+            <w:hyperlink r:id="rId13" w:history="1">
               <w:r>
                 <w:rPr>
                   <w:rStyle w:val="Hyperlink"/>
@@ -1502,7 +1730,21 @@
               <w:rPr>
                 <w:color w:val="000000"/>
               </w:rPr>
-              <w:t xml:space="preserve">) Opportunities to synchronise and date archaeological and climate records in Northwest Africa using volcanic ash (tephra) layers, </w:t>
+              <w:t xml:space="preserve">) </w:t>
+            </w:r>
+            <w:r>
+              <w:rPr>
+                <w:b/>
+                <w:bCs/>
+                <w:color w:val="000000"/>
+              </w:rPr>
+              <w:t>Opportunities to synchronise and date archaeological and climate records in Northwest Africa using volcanic ash (tephra) layers</w:t>
+            </w:r>
+            <w:r>
+              <w:rPr>
+                <w:color w:val="000000"/>
+              </w:rPr>
+              <w:t xml:space="preserve">, </w:t>
             </w:r>
             <w:r>
               <w:rPr>
@@ -1517,7 +1759,7 @@
               </w:rPr>
               <w:t xml:space="preserve"> (</w:t>
             </w:r>
-            <w:hyperlink r:id="rId13" w:history="1">
+            <w:hyperlink r:id="rId14" w:history="1">
               <w:r>
                 <w:rPr>
                   <w:rStyle w:val="Hyperlink"/>
@@ -1610,7 +1852,21 @@
               <w:rPr>
                 <w:color w:val="000000"/>
               </w:rPr>
-              <w:t xml:space="preserve"> Pleistocene drivers of Northwest African hydroclimate and vegetation, </w:t>
+              <w:t xml:space="preserve"> </w:t>
+            </w:r>
+            <w:r>
+              <w:rPr>
+                <w:b/>
+                <w:bCs/>
+                <w:color w:val="000000"/>
+              </w:rPr>
+              <w:t>Pleistocene drivers of Northwest African hydroclimate and vegetation</w:t>
+            </w:r>
+            <w:r>
+              <w:rPr>
+                <w:color w:val="000000"/>
+              </w:rPr>
+              <w:t xml:space="preserve">, </w:t>
             </w:r>
             <w:r>
               <w:rPr>
@@ -1625,7 +1881,7 @@
               </w:rPr>
               <w:t xml:space="preserve"> (</w:t>
             </w:r>
-            <w:hyperlink r:id="rId14" w:history="1">
+            <w:hyperlink r:id="rId15" w:history="1">
               <w:r>
                 <w:rPr>
                   <w:rStyle w:val="Hyperlink"/>
@@ -1695,7 +1951,17 @@
               <w:t>2019</w:t>
             </w:r>
             <w:r>
-              <w:t xml:space="preserve">) Subtropical Pacific Ocean temperature fluctuations in the Common Era: Multidecadal variability and its relationship with Southwestern North American megadroughts, </w:t>
+              <w:t xml:space="preserve">) </w:t>
+            </w:r>
+            <w:r>
+              <w:rPr>
+                <w:b/>
+                <w:bCs/>
+              </w:rPr>
+              <w:t>Subtropical Pacific Ocean temperature fluctuations in the Common Era: Multidecadal variability and its relationship with Southwestern North American megadroughts</w:t>
+            </w:r>
+            <w:r>
+              <w:t xml:space="preserve">, </w:t>
             </w:r>
             <w:r>
               <w:rPr>
@@ -1706,7 +1972,7 @@
             <w:r>
               <w:t>(</w:t>
             </w:r>
-            <w:hyperlink r:id="rId15" w:history="1">
+            <w:hyperlink r:id="rId16" w:history="1">
               <w:r>
                 <w:rPr>
                   <w:rStyle w:val="Hyperlink"/>
@@ -1774,7 +2040,17 @@
               <w:t>2019</w:t>
             </w:r>
             <w:r>
-              <w:t xml:space="preserve">) Hot spots of carbon and alkalinity cycling in the coastal oceans, </w:t>
+              <w:t xml:space="preserve">) </w:t>
+            </w:r>
+            <w:r>
+              <w:rPr>
+                <w:b/>
+                <w:bCs/>
+              </w:rPr>
+              <w:t>Hot spots of carbon and alkalinity cycling in the coastal oceans</w:t>
+            </w:r>
+            <w:r>
+              <w:t xml:space="preserve">, </w:t>
             </w:r>
             <w:r>
               <w:rPr>
@@ -1785,7 +2061,7 @@
             <w:r>
               <w:t xml:space="preserve"> (</w:t>
             </w:r>
-            <w:hyperlink r:id="rId16" w:history="1">
+            <w:hyperlink r:id="rId17" w:history="1">
               <w:r>
                 <w:rPr>
                   <w:rStyle w:val="Hyperlink"/>
@@ -1880,7 +2156,21 @@
               <w:rPr>
                 <w:color w:val="000000"/>
               </w:rPr>
-              <w:t>; Smolen, J.D.; Worthey, K.; Schefuß, E.; Kuhlmann, H.; Vachula, R.S.; Smith, V.; Barton, N.; Uno. K.; North African environments in the age of Homo sapiens: Pleistocene hydrology-ecology-fire-temperature influences on human evolution and development (</w:t>
+              <w:t xml:space="preserve">; Smolen, J.D.; Worthey, K.; Schefuß, E.; Kuhlmann, H.; Vachula, R.S.; Smith, V.; Barton, N.; Uno. K.; North </w:t>
+            </w:r>
+            <w:r>
+              <w:rPr>
+                <w:b/>
+                <w:bCs/>
+                <w:color w:val="000000"/>
+              </w:rPr>
+              <w:t>African environments in the age of Homo sapiens: Pleistocene hydrology-ecology-fire-temperature influences on human evolution and development</w:t>
+            </w:r>
+            <w:r>
+              <w:rPr>
+                <w:color w:val="000000"/>
+              </w:rPr>
+              <w:t xml:space="preserve"> (</w:t>
             </w:r>
             <w:r>
               <w:rPr>
@@ -1944,20 +2234,198 @@
               <w:rPr>
                 <w:color w:val="000000"/>
               </w:rPr>
-              <w:t>; Ong, M.R.; Schmidt, G.; Vachula, R.; Wu, L.; Zhang, B.;Characterizing Natural Aerosol Variability and its Uncertainty in the Earth System (</w:t>
+              <w:t>; Ong, M.R.; Schmidt, G.; Vachula, R.; Wu, L.; Zhang, B.;</w:t>
+            </w:r>
+            <w:r>
+              <w:rPr>
+                <w:b/>
+                <w:bCs/>
+                <w:color w:val="000000"/>
+              </w:rPr>
+              <w:t>Characterizing Natural Aerosol Variability and its Uncertainty in the Earth System</w:t>
+            </w:r>
+            <w:r>
+              <w:rPr>
+                <w:color w:val="000000"/>
+              </w:rPr>
+              <w:t xml:space="preserve"> (</w:t>
             </w:r>
             <w:r>
               <w:rPr>
                 <w:i/>
                 <w:color w:val="000000"/>
               </w:rPr>
-              <w:t>in review, Atmospheric Chemistry and Physics</w:t>
+              <w:t>in revision, Atmospheric Chemistry and Physics</w:t>
             </w:r>
             <w:r>
               <w:rPr>
                 <w:color w:val="000000"/>
               </w:rPr>
               <w:t>)</w:t>
+            </w:r>
+          </w:p>
+        </w:tc>
+      </w:tr>
+      <w:tr>
+        <w:trPr>
+          <w:trHeight w:val="125"/>
+        </w:trPr>
+        <w:tc>
+          <w:tcPr>
+            <w:tcW w:w="1440" w:type="dxa"/>
+          </w:tcPr>
+          <w:p>
+            <w:pPr>
+              <w:rPr>
+                <w:sz w:val="12"/>
+                <w:szCs w:val="12"/>
+              </w:rPr>
+            </w:pPr>
+          </w:p>
+        </w:tc>
+        <w:tc>
+          <w:tcPr>
+            <w:tcW w:w="8640" w:type="dxa"/>
+          </w:tcPr>
+          <w:p>
+            <w:pPr>
+              <w:rPr>
+                <w:color w:val="000000"/>
+                <w:sz w:val="12"/>
+                <w:szCs w:val="12"/>
+              </w:rPr>
+            </w:pPr>
+          </w:p>
+        </w:tc>
+      </w:tr>
+      <w:tr>
+        <w:tc>
+          <w:tcPr>
+            <w:tcW w:w="1440" w:type="dxa"/>
+          </w:tcPr>
+          <w:p/>
+        </w:tc>
+        <w:tc>
+          <w:tcPr>
+            <w:tcW w:w="8640" w:type="dxa"/>
+          </w:tcPr>
+          <w:p>
+            <w:pPr>
+              <w:rPr>
+                <w:color w:val="000000"/>
+              </w:rPr>
+            </w:pPr>
+            <w:r>
+              <w:rPr>
+                <w:b/>
+                <w:bCs/>
+                <w:color w:val="000000"/>
+              </w:rPr>
+              <w:t>O’Mara, N.A.</w:t>
+            </w:r>
+            <w:r>
+              <w:rPr>
+                <w:color w:val="000000"/>
+              </w:rPr>
+              <w:t xml:space="preserve">; Vachula, R.S.; Hoffman, N.; </w:t>
+            </w:r>
+            <w:proofErr w:type="spellStart"/>
+            <w:r>
+              <w:rPr>
+                <w:color w:val="000000"/>
+              </w:rPr>
+              <w:t>Glückler</w:t>
+            </w:r>
+            <w:proofErr w:type="spellEnd"/>
+            <w:r>
+              <w:rPr>
+                <w:color w:val="000000"/>
+              </w:rPr>
+              <w:t xml:space="preserve">, R.; Gavin, D.G.; Leys, B.; </w:t>
+            </w:r>
+            <w:proofErr w:type="spellStart"/>
+            <w:r>
+              <w:rPr>
+                <w:color w:val="000000"/>
+              </w:rPr>
+              <w:t>Feurdean</w:t>
+            </w:r>
+            <w:proofErr w:type="spellEnd"/>
+            <w:r>
+              <w:rPr>
+                <w:color w:val="000000"/>
+              </w:rPr>
+              <w:t xml:space="preserve">, A.; Dietze, E.; Williams, J.W; </w:t>
+            </w:r>
+            <w:proofErr w:type="spellStart"/>
+            <w:r>
+              <w:rPr>
+                <w:color w:val="000000"/>
+              </w:rPr>
+              <w:t>Domic</w:t>
+            </w:r>
+            <w:proofErr w:type="spellEnd"/>
+            <w:r>
+              <w:rPr>
+                <w:color w:val="000000"/>
+              </w:rPr>
+              <w:t xml:space="preserve"> Rivadeneira, A.I.; Raj, A.; </w:t>
+            </w:r>
+            <w:proofErr w:type="spellStart"/>
+            <w:r>
+              <w:rPr>
+                <w:color w:val="000000"/>
+              </w:rPr>
+              <w:t>Debengwa</w:t>
+            </w:r>
+            <w:proofErr w:type="spellEnd"/>
+            <w:r>
+              <w:rPr>
+                <w:color w:val="000000"/>
+              </w:rPr>
+              <w:t xml:space="preserve">, A.; Ruis, D.; Karp, T.; </w:t>
+            </w:r>
+            <w:proofErr w:type="spellStart"/>
+            <w:r>
+              <w:rPr>
+                <w:color w:val="000000"/>
+              </w:rPr>
+              <w:t>Finsinger</w:t>
+            </w:r>
+            <w:proofErr w:type="spellEnd"/>
+            <w:r>
+              <w:rPr>
+                <w:color w:val="000000"/>
+              </w:rPr>
+              <w:t xml:space="preserve">, W.; Delgadillo-Salas, A.; Courtney Mustaphi, C.; Gil-Romera, G.; Bartlein, P.J.; Githumbi, E.; Norville, C.; Dominguez-Vidana, S.E.;, Staver, A.C.; Ivory, S.J.; Marlon, J.R.; </w:t>
+            </w:r>
+            <w:r>
+              <w:rPr>
+                <w:b/>
+                <w:bCs/>
+                <w:color w:val="000000"/>
+              </w:rPr>
+              <w:t>The Global Paleofire Database on Neotoma: Towards a Sustainable Future for the International Paleofire Network</w:t>
+            </w:r>
+            <w:r>
+              <w:rPr>
+                <w:color w:val="000000"/>
+              </w:rPr>
+              <w:t xml:space="preserve"> (</w:t>
+            </w:r>
+            <w:r>
+              <w:rPr>
+                <w:i/>
+                <w:iCs/>
+                <w:color w:val="000000"/>
+              </w:rPr>
+              <w:t>in prep for Quaternary International</w:t>
+            </w:r>
+            <w:r>
+              <w:rPr>
+                <w:color w:val="000000"/>
+              </w:rPr>
+              <w:t xml:space="preserve">) </w:t>
             </w:r>
           </w:p>
         </w:tc>
@@ -2002,7 +2470,21 @@
               <w:rPr>
                 <w:color w:val="000000"/>
               </w:rPr>
-              <w:t>; Githumbi, E.N.; Bartlein, P.J.; Dabengwa, A.; Teruel, O.; Norwood, M.; Aleman, J.; A.; Marlon, J.R.; Staver, A.C. Precipitation and human activity primarily controlled African fire activity since the last glacial maximum (</w:t>
+              <w:t xml:space="preserve">; Githumbi, E.N.; Bartlein, P.J.; Dabengwa, A.; Teruel, O.; Norwood, M.; Aleman, J.; A.; Marlon, J.R.; Staver, A.C. </w:t>
+            </w:r>
+            <w:r>
+              <w:rPr>
+                <w:b/>
+                <w:bCs/>
+                <w:color w:val="000000"/>
+              </w:rPr>
+              <w:t>Precipitation and human activity primarily controlled African fire activity since the last glacial maximum</w:t>
+            </w:r>
+            <w:r>
+              <w:rPr>
+                <w:color w:val="000000"/>
+              </w:rPr>
+              <w:t xml:space="preserve"> (</w:t>
             </w:r>
             <w:r>
               <w:rPr>
@@ -2060,13 +2542,27 @@
                 <w:b/>
                 <w:color w:val="000000"/>
               </w:rPr>
-              <w:t xml:space="preserve"> O'Mara, N. A.; </w:t>
-            </w:r>
-            <w:r>
-              <w:rPr>
-                <w:color w:val="000000"/>
-              </w:rPr>
-              <w:t>Karp, A. T.; Analyzing PAH Concentrations in Experimental Burn Plot Soils to Improve Reconstructions of Savanna Fires (</w:t>
+              <w:t xml:space="preserve"> O'Mara, N.A.; </w:t>
+            </w:r>
+            <w:r>
+              <w:rPr>
+                <w:color w:val="000000"/>
+              </w:rPr>
+              <w:t xml:space="preserve">Karp, A. T.; </w:t>
+            </w:r>
+            <w:r>
+              <w:rPr>
+                <w:b/>
+                <w:bCs/>
+                <w:color w:val="000000"/>
+              </w:rPr>
+              <w:t>Analyzing PAH Concentrations in Experimental Burn Plot Soils to Improve Reconstructions of Savanna Fires</w:t>
+            </w:r>
+            <w:r>
+              <w:rPr>
+                <w:color w:val="000000"/>
+              </w:rPr>
+              <w:t xml:space="preserve"> (</w:t>
             </w:r>
             <w:r>
               <w:rPr>
@@ -2124,7 +2620,21 @@
               <w:rPr>
                 <w:color w:val="000000"/>
               </w:rPr>
-              <w:t>; de Menocal, P. B.; Uno, K. T.; Tierney, J. E.; Polissar, P.J.; The role of fire in Northwest African ecosystem transitions during the last deglaciation to late-Holocene (</w:t>
+              <w:t xml:space="preserve">; de Menocal, P. B.; Uno, K. T.; Tierney, J. E.; Polissar, P.J.; </w:t>
+            </w:r>
+            <w:r>
+              <w:rPr>
+                <w:b/>
+                <w:bCs/>
+                <w:color w:val="000000"/>
+              </w:rPr>
+              <w:t>The role of fire in Northwest African ecosystem transitions during the last deglaciation to late-Holocene</w:t>
+            </w:r>
+            <w:r>
+              <w:rPr>
+                <w:color w:val="000000"/>
+              </w:rPr>
+              <w:t xml:space="preserve"> (</w:t>
             </w:r>
             <w:r>
               <w:rPr>
@@ -2221,7 +2731,21 @@
               <w:rPr>
                 <w:color w:val="000000"/>
               </w:rPr>
-              <w:t xml:space="preserve">Collaborative research: “Mapping global fire activity since the Last Glacial Maximum for improved fire modeling and management.” </w:t>
+              <w:t>Collaborative research: “</w:t>
+            </w:r>
+            <w:r>
+              <w:rPr>
+                <w:b/>
+                <w:bCs/>
+                <w:color w:val="000000"/>
+              </w:rPr>
+              <w:t>Mapping global fire activity since the Last Glacial Maximum for improved fire modeling and management</w:t>
+            </w:r>
+            <w:r>
+              <w:rPr>
+                <w:color w:val="000000"/>
+              </w:rPr>
+              <w:t xml:space="preserve">.” </w:t>
             </w:r>
             <w:r>
               <w:rPr>
@@ -2234,7 +2758,19 @@
               <w:rPr>
                 <w:color w:val="000000"/>
               </w:rPr>
-              <w:t xml:space="preserve">: Carlas Staver (Princeton University) and Jenn Marlon (Yale University). Grant contributor: Nicholas O’Mara used to support upcoming Associate Research Scientist appointment at Princeton University. </w:t>
+              <w:t>: Carla Staver (Princeton University) and Jenn</w:t>
+            </w:r>
+            <w:r>
+              <w:rPr>
+                <w:color w:val="000000"/>
+              </w:rPr>
+              <w:t>ifer</w:t>
+            </w:r>
+            <w:r>
+              <w:rPr>
+                <w:color w:val="000000"/>
+              </w:rPr>
+              <w:t xml:space="preserve"> Marlon (Yale University). Grant contributor: Nicholas O’Mara used to support upcoming Associate Research Scientist appointment at Princeton University. </w:t>
             </w:r>
             <w:r>
               <w:rPr>
@@ -2297,9 +2833,17 @@
             </w:r>
             <w:r>
               <w:rPr>
+                <w:b/>
+                <w:bCs/>
+                <w:iCs/>
+              </w:rPr>
+              <w:t>Paleofire-climate variation in Africa: data-model comparisons since the Last Glacial Maximum for improved estimation of wildfire in the Earth system</w:t>
+            </w:r>
+            <w:r>
+              <w:rPr>
                 <w:i/>
               </w:rPr>
-              <w:t>Paleofire-climate variation in Africa: data-model comparisons since the Last Glacial Maximum for improved estimation of wildfire in the Earth system.”</w:t>
+              <w:t>.”</w:t>
             </w:r>
             <w:r>
               <w:t xml:space="preserve"> </w:t>
@@ -2376,7 +2920,9 @@
             </w:r>
             <w:r>
               <w:rPr>
-                <w:i/>
+                <w:b/>
+                <w:bCs/>
+                <w:iCs/>
               </w:rPr>
               <w:t>Assessing the role of fire in the African Humid Period transitions: a novel biomarker approach to paleo-fire reconstruction</w:t>
             </w:r>
@@ -2773,6 +3319,7 @@
               <w:rPr>
                 <w:b/>
               </w:rPr>
+              <w:lastRenderedPageBreak/>
               <w:t>2023</w:t>
             </w:r>
           </w:p>
@@ -3120,11 +3667,7 @@
               <w:t>2017</w:t>
             </w:r>
             <w:r>
-              <w:t xml:space="preserve">) Analyzing forced and internal variability in last millennium subtropical eastern Pacific climate </w:t>
-            </w:r>
-            <w:r>
-              <w:lastRenderedPageBreak/>
-              <w:t xml:space="preserve">using an alkenone-derived record of SST and productivity variability. </w:t>
+              <w:t xml:space="preserve">) Analyzing forced and internal variability in last millennium subtropical eastern Pacific climate using an alkenone-derived record of SST and productivity variability. </w:t>
             </w:r>
             <w:r>
               <w:rPr>
@@ -3757,6 +4300,7 @@
               <w:rPr>
                 <w:b/>
               </w:rPr>
+              <w:lastRenderedPageBreak/>
               <w:t>2023</w:t>
             </w:r>
           </w:p>
@@ -4251,14 +4795,7 @@
               <w:rPr>
                 <w:color w:val="222222"/>
               </w:rPr>
-              <w:t xml:space="preserve">) Understanding Abrupt, Natural Climate Variability Post-Industrial Revolution from the </w:t>
-            </w:r>
-            <w:r>
-              <w:rPr>
-                <w:color w:val="222222"/>
-              </w:rPr>
-              <w:lastRenderedPageBreak/>
-              <w:t>Subtropical Eastern Pacific: A Novel High Resolution Alkenone-derived Sea Surface Temperature Record. </w:t>
+              <w:t>) Understanding Abrupt, Natural Climate Variability Post-Industrial Revolution from the Subtropical Eastern Pacific: A Novel High Resolution Alkenone-derived Sea Surface Temperature Record. </w:t>
             </w:r>
             <w:r>
               <w:rPr>
@@ -4443,7 +4980,21 @@
                 <w:b/>
                 <w:color w:val="222222"/>
               </w:rPr>
-              <w:t>New York University Gallatin School (2026)</w:t>
+              <w:t>New York University Gallatin School (2026</w:t>
+            </w:r>
+            <w:r>
+              <w:rPr>
+                <w:b/>
+                <w:color w:val="222222"/>
+              </w:rPr>
+              <w:t>; Fall + Spring</w:t>
+            </w:r>
+            <w:r>
+              <w:rPr>
+                <w:b/>
+                <w:color w:val="222222"/>
+              </w:rPr>
+              <w:t>)</w:t>
             </w:r>
             <w:r>
               <w:rPr>
@@ -4928,6 +5479,7 @@
               <w:rPr>
                 <w:b/>
               </w:rPr>
+              <w:lastRenderedPageBreak/>
               <w:t>2017</w:t>
             </w:r>
           </w:p>
@@ -5306,7 +5858,6 @@
             </w14:solidFill>
           </w14:textFill>
         </w:rPr>
-        <w:lastRenderedPageBreak/>
         <w:t>Teaching Experience</w:t>
       </w:r>
       <w:r>
@@ -5658,81 +6209,6 @@
           <w:p/>
         </w:tc>
       </w:tr>
-      <w:tr>
-        <w:tc>
-          <w:tcPr>
-            <w:tcW w:w="10080" w:type="dxa"/>
-            <w:gridSpan w:val="2"/>
-          </w:tcPr>
-          <w:p>
-            <w:r>
-              <w:rPr>
-                <w:i/>
-              </w:rPr>
-              <w:t>Pedagogical Training:</w:t>
-            </w:r>
-          </w:p>
-        </w:tc>
-      </w:tr>
-      <w:tr>
-        <w:trPr>
-          <w:trHeight w:hRule="exact" w:val="120"/>
-        </w:trPr>
-        <w:tc>
-          <w:tcPr>
-            <w:tcW w:w="1440" w:type="dxa"/>
-          </w:tcPr>
-          <w:p/>
-        </w:tc>
-        <w:tc>
-          <w:tcPr>
-            <w:tcW w:w="8640" w:type="dxa"/>
-          </w:tcPr>
-          <w:p/>
-        </w:tc>
-      </w:tr>
-      <w:tr>
-        <w:tc>
-          <w:tcPr>
-            <w:tcW w:w="1440" w:type="dxa"/>
-          </w:tcPr>
-          <w:p>
-            <w:r>
-              <w:rPr>
-                <w:b/>
-              </w:rPr>
-              <w:t>2022–present</w:t>
-            </w:r>
-          </w:p>
-        </w:tc>
-        <w:tc>
-          <w:tcPr>
-            <w:tcW w:w="8640" w:type="dxa"/>
-          </w:tcPr>
-          <w:p>
-            <w:r>
-              <w:rPr>
-                <w:b/>
-              </w:rPr>
-              <w:t>Yale University Poorvu Center Certificate of College Teaching Preparation</w:t>
-            </w:r>
-          </w:p>
-          <w:p>
-            <w:r>
-              <w:t xml:space="preserve">A wide-ranging training program in pedagogy and classroom practices for college-level instruction. Example selected seminars: </w:t>
-            </w:r>
-            <w:r>
-              <w:rPr>
-                <w:i/>
-              </w:rPr>
-              <w:t>Course Design, Mental Health in the Classroom, Practicing Anti-racist Pedagogy, Using Technology Equitably</w:t>
-            </w:r>
-            <w:r>
-              <w:t>, among others.</w:t>
-            </w:r>
-          </w:p>
-        </w:tc>
-      </w:tr>
     </w:tbl>
     <w:p>
       <w:pPr>
@@ -5907,7 +6383,7 @@
     </w:p>
     <w:tbl>
       <w:tblPr>
-        <w:tblW w:w="0" w:type="auto"/>
+        <w:tblW w:w="10080" w:type="dxa"/>
         <w:tblLayout w:type="fixed"/>
         <w:tblCellMar>
           <w:left w:w="0" w:type="dxa"/>
@@ -5930,6 +6406,7 @@
               <w:rPr>
                 <w:i/>
               </w:rPr>
+              <w:lastRenderedPageBreak/>
               <w:t>Leadership:</w:t>
             </w:r>
           </w:p>
@@ -5958,6 +6435,91 @@
             <w:tcW w:w="1440" w:type="dxa"/>
           </w:tcPr>
           <w:p>
+            <w:pPr>
+              <w:rPr>
+                <w:b/>
+              </w:rPr>
+            </w:pPr>
+            <w:r>
+              <w:rPr>
+                <w:b/>
+              </w:rPr>
+              <w:t>2026</w:t>
+            </w:r>
+          </w:p>
+        </w:tc>
+        <w:tc>
+          <w:tcPr>
+            <w:tcW w:w="8640" w:type="dxa"/>
+          </w:tcPr>
+          <w:p>
+            <w:r>
+              <w:rPr>
+                <w:b/>
+              </w:rPr>
+              <w:t>AGU Annual Meeting Session Convener</w:t>
+            </w:r>
+          </w:p>
+          <w:p>
+            <w:pPr>
+              <w:rPr>
+                <w:bCs/>
+              </w:rPr>
+            </w:pPr>
+            <w:r>
+              <w:rPr>
+                <w:bCs/>
+              </w:rPr>
+              <w:t>Sessions</w:t>
+            </w:r>
+            <w:r>
+              <w:rPr>
+                <w:bCs/>
+              </w:rPr>
+              <w:t xml:space="preserve"> (TBD): </w:t>
+            </w:r>
+            <w:r>
+              <w:t>Paleo- and Historical Perspectives on Fire in the Earth System</w:t>
+            </w:r>
+          </w:p>
+        </w:tc>
+      </w:tr>
+      <w:tr>
+        <w:tc>
+          <w:tcPr>
+            <w:tcW w:w="1440" w:type="dxa"/>
+          </w:tcPr>
+          <w:p>
+            <w:pPr>
+              <w:rPr>
+                <w:b/>
+                <w:sz w:val="12"/>
+                <w:szCs w:val="12"/>
+              </w:rPr>
+            </w:pPr>
+          </w:p>
+        </w:tc>
+        <w:tc>
+          <w:tcPr>
+            <w:tcW w:w="8640" w:type="dxa"/>
+          </w:tcPr>
+          <w:p>
+            <w:pPr>
+              <w:rPr>
+                <w:b/>
+                <w:sz w:val="12"/>
+                <w:szCs w:val="12"/>
+              </w:rPr>
+            </w:pPr>
+          </w:p>
+        </w:tc>
+      </w:tr>
+      <w:tr>
+        <w:tc>
+          <w:tcPr>
+            <w:tcW w:w="1440" w:type="dxa"/>
+          </w:tcPr>
+          <w:p>
             <w:r>
               <w:rPr>
                 <w:b/>
@@ -6230,7 +6792,6 @@
           </w:p>
           <w:p>
             <w:r>
-              <w:lastRenderedPageBreak/>
               <w:t>Session PP039: Reconstructing Regional Hydrologic Changes Across Climatic Boundaries in the Recent Past</w:t>
             </w:r>
           </w:p>
@@ -6407,6 +6968,9 @@
           </w:p>
           <w:p>
             <w:r>
+              <w:t xml:space="preserve">During my junior year, </w:t>
+            </w:r>
+            <w:r>
               <w:t>I guided a sophomore on academic decisions, course selection, concentration declarations, and summer research and internship opportunities.</w:t>
             </w:r>
           </w:p>
@@ -7097,7 +7661,6 @@
               <w:rPr>
                 <w:b/>
               </w:rPr>
-              <w:lastRenderedPageBreak/>
               <w:t>2019</w:t>
             </w:r>
           </w:p>
@@ -7149,13 +7712,13 @@
         <w:rPr>
           <w:szCs w:val="22"/>
         </w:rPr>
-        <w:t xml:space="preserve"> 1</w:t>
+        <w:t xml:space="preserve"> </w:t>
       </w:r>
       <w:r>
         <w:rPr>
           <w:szCs w:val="22"/>
         </w:rPr>
-        <w:t>2</w:t>
+        <w:t>26</w:t>
       </w:r>
       <w:r>
         <w:rPr>
@@ -7165,8 +7728,8 @@
       </w:r>
     </w:p>
     <w:sectPr>
-      <w:footerReference w:type="even" r:id="rId17"/>
-      <w:footerReference w:type="default" r:id="rId18"/>
+      <w:footerReference w:type="even" r:id="rId18"/>
+      <w:footerReference w:type="default" r:id="rId19"/>
       <w:pgSz w:w="12240" w:h="15840"/>
       <w:pgMar w:top="1080" w:right="1080" w:bottom="1080" w:left="1080" w:header="720" w:footer="720" w:gutter="0"/>
       <w:cols w:space="720"/>
@@ -10685,7 +11248,6 @@
   <w:style w:type="character" w:default="1" w:styleId="DefaultParagraphFont">
     <w:name w:val="Default Paragraph Font"/>
     <w:uiPriority w:val="1"/>
-    <w:semiHidden/>
     <w:unhideWhenUsed/>
   </w:style>
   <w:style w:type="table" w:default="1" w:styleId="TableNormal">

</xml_diff>